<commit_message>
docs: add sprint 1 documentation and backlog files
</commit_message>
<xml_diff>
--- a/Apuntes/Sprints/sprint 1 v2.docx
+++ b/Apuntes/Sprints/sprint 1 v2.docx
@@ -1,6 +1,6 @@
 
 <file path=word/document.xml><?xml version="1.0" encoding="utf-8"?>
-<w:document xmlns:o="urn:schemas-microsoft-com:office:office" xmlns:r="http://schemas.openxmlformats.org/officeDocument/2006/relationships" xmlns:v="urn:schemas-microsoft-com:vml" xmlns:w="http://schemas.openxmlformats.org/wordprocessingml/2006/main" xmlns:w10="urn:schemas-microsoft-com:office:word" xmlns:wp="http://schemas.openxmlformats.org/drawingml/2006/wordprocessingDrawing" xmlns:wps="http://schemas.microsoft.com/office/word/2010/wordprocessingShape" xmlns:wpg="http://schemas.microsoft.com/office/word/2010/wordprocessingGroup" xmlns:mc="http://schemas.openxmlformats.org/markup-compatibility/2006" xmlns:wp14="http://schemas.microsoft.com/office/word/2010/wordprocessingDrawing" xmlns:w14="http://schemas.microsoft.com/office/word/2010/wordml" xmlns:w15="http://schemas.microsoft.com/office/word/2012/wordml" mc:Ignorable="w14 wp14 w15">
+<w:document xmlns:wpc="http://schemas.microsoft.com/office/word/2010/wordprocessingCanvas" xmlns:mc="http://schemas.openxmlformats.org/markup-compatibility/2006" xmlns:o="urn:schemas-microsoft-com:office:office" xmlns:r="http://schemas.openxmlformats.org/officeDocument/2006/relationships" xmlns:m="http://schemas.openxmlformats.org/officeDocument/2006/math" xmlns:v="urn:schemas-microsoft-com:vml" xmlns:wp14="http://schemas.microsoft.com/office/word/2010/wordprocessingDrawing" xmlns:wp="http://schemas.openxmlformats.org/drawingml/2006/wordprocessingDrawing" xmlns:w10="urn:schemas-microsoft-com:office:word" xmlns:w="http://schemas.openxmlformats.org/wordprocessingml/2006/main" xmlns:w14="http://schemas.microsoft.com/office/word/2010/wordml" xmlns:w15="http://schemas.microsoft.com/office/word/2012/wordml" xmlns:w16se="http://schemas.microsoft.com/office/word/2015/wordml/symex" xmlns:w16cid="http://schemas.microsoft.com/office/word/2016/wordml/cid" xmlns:w16="http://schemas.microsoft.com/office/word/2018/wordml" xmlns:w16cex="http://schemas.microsoft.com/office/word/2018/wordml/cex" xmlns:w16sdtdh="http://schemas.microsoft.com/office/word/2020/wordml/sdtdatahash" xmlns:wne="http://schemas.microsoft.com/office/word/2006/wordml" xmlns:wpg="http://schemas.microsoft.com/office/word/2010/wordprocessingGroup" xmlns:wps="http://schemas.microsoft.com/office/word/2010/wordprocessingShape" mc:Ignorable="w14 w15 w16se w16cid w16 w16cex w16sdtdh wp14">
   <w:body>
     <w:p>
       <w:pPr>
@@ -28,26 +28,32 @@
       </w:pPr>
       <w:r>
         <w:rPr>
+          <w:rFonts w:ascii="Calibri" w:hAnsi="Calibri" w:eastAsia="Calibri" w:cs="Calibri" w:asciiTheme="minorHAnsi" w:hAnsiTheme="minorHAnsi" w:eastAsiaTheme="minorHAnsi" w:csTheme="minorBidi"/>
+          <w:b/>
+          <w:bCs/>
+          <w:kern w:val="0"/>
+          <w:sz w:val="28"/>
+          <w:szCs w:val="28"/>
+        </w:rPr>
+        <w:t>CÁTEDRA: Ing. Software y Calidad del Software</w:t>
+      </w:r>
+    </w:p>
+    <w:p>
+      <w:pPr>
+        <w:pStyle w:val="Normal"/>
+        <w:jc w:val="center"/>
+        <w:rPr>
           <w:b/>
           <w:sz w:val="28"/>
           <w:szCs w:val="28"/>
         </w:rPr>
-        <w:t>CÁTEDRA: Ing. Software y Calidad del Software</w:t>
-      </w:r>
-    </w:p>
-    <w:p>
-      <w:pPr>
-        <w:pStyle w:val="Normal"/>
-        <w:jc w:val="center"/>
-        <w:rPr>
+      </w:pPr>
+      <w:r>
+        <w:rPr>
+          <w:rFonts w:ascii="Calibri" w:hAnsi="Calibri" w:eastAsia="Calibri" w:cs="Calibri" w:asciiTheme="minorHAnsi" w:hAnsiTheme="minorHAnsi" w:eastAsiaTheme="minorHAnsi" w:csTheme="minorBidi"/>
           <w:b/>
-          <w:sz w:val="28"/>
-          <w:szCs w:val="28"/>
-        </w:rPr>
-      </w:pPr>
-      <w:r>
-        <w:rPr>
-          <w:b/>
+          <w:bCs/>
+          <w:kern w:val="0"/>
           <w:sz w:val="28"/>
           <w:szCs w:val="28"/>
         </w:rPr>
@@ -59,8 +65,8 @@
         <w:pStyle w:val="Normal"/>
         <w:tabs>
           <w:tab w:val="clear" w:pos="708"/>
-          <w:tab w:val="left" w:pos="3240" w:leader="none"/>
-          <w:tab w:val="center" w:pos="4252" w:leader="none"/>
+          <w:tab w:val="left" w:pos="3240"/>
+          <w:tab w:val="center" w:pos="4252"/>
         </w:tabs>
         <w:jc w:val="both"/>
         <w:rPr>
@@ -69,7 +75,12 @@
       </w:pPr>
       <w:r>
         <w:rPr>
+          <w:rFonts w:ascii="Calibri" w:hAnsi="Calibri" w:eastAsia="Calibri" w:cs="Calibri" w:asciiTheme="minorHAnsi" w:hAnsiTheme="minorHAnsi" w:eastAsiaTheme="minorHAnsi" w:csTheme="minorBidi"/>
           <w:b/>
+          <w:bCs/>
+          <w:kern w:val="0"/>
+          <w:sz w:val="22"/>
+          <w:szCs w:val="22"/>
         </w:rPr>
         <w:t>Integrantes del Grupo:</w:t>
       </w:r>
@@ -92,17 +103,26 @@
       <w:pPr>
         <w:pStyle w:val="Normal"/>
         <w:jc w:val="both"/>
-        <w:rPr/>
-      </w:pPr>
-      <w:r>
-        <w:rPr>
+      </w:pPr>
+      <w:r>
+        <w:rPr>
+          <w:rFonts w:ascii="Calibri" w:hAnsi="Calibri" w:eastAsia="Calibri" w:cs="Calibri" w:asciiTheme="minorHAnsi" w:hAnsiTheme="minorHAnsi" w:eastAsiaTheme="minorHAnsi" w:csTheme="minorBidi"/>
           <w:b/>
+          <w:bCs/>
+          <w:kern w:val="0"/>
+          <w:sz w:val="22"/>
+          <w:szCs w:val="22"/>
         </w:rPr>
         <w:t xml:space="preserve">Contenido Sprint </w:t>
       </w:r>
       <w:r>
         <w:rPr>
+          <w:rFonts w:ascii="Calibri" w:hAnsi="Calibri" w:eastAsia="Calibri" w:cs="Calibri" w:asciiTheme="minorHAnsi" w:hAnsiTheme="minorHAnsi" w:eastAsiaTheme="minorHAnsi" w:csTheme="minorBidi"/>
           <w:b/>
+          <w:bCs/>
+          <w:kern w:val="0"/>
+          <w:sz w:val="22"/>
+          <w:szCs w:val="22"/>
         </w:rPr>
         <w:t>1</w:t>
       </w:r>
@@ -110,116 +130,191 @@
     <w:p>
       <w:pPr>
         <w:pStyle w:val="Normal"/>
-        <w:rPr/>
-      </w:pPr>
-      <w:r>
-        <w:rPr/>
+        <w:jc w:val="left"/>
+      </w:pPr>
+      <w:r>
+        <w:rPr>
+          <w:rFonts w:ascii="Calibri" w:hAnsi="Calibri" w:eastAsia="Calibri" w:cs="Calibri" w:asciiTheme="minorHAnsi" w:hAnsiTheme="minorHAnsi" w:eastAsiaTheme="minorHAnsi" w:csTheme="minorBidi"/>
+          <w:kern w:val="0"/>
+          <w:sz w:val="22"/>
+          <w:szCs w:val="22"/>
+        </w:rPr>
         <w:t xml:space="preserve">Para continuar el trabajo final integrador vamos a planificar el Sprint Nro 1 que tendrá una duración aprox de 30 días con el objetivo de presentarse en la primer semana del mes de Septiembre (miércoles </w:t>
       </w:r>
       <w:r>
-        <w:rPr/>
+        <w:rPr>
+          <w:rFonts w:ascii="Calibri" w:hAnsi="Calibri" w:eastAsia="Calibri" w:cs="Calibri" w:asciiTheme="minorHAnsi" w:hAnsiTheme="minorHAnsi" w:eastAsiaTheme="minorHAnsi" w:csTheme="minorBidi"/>
+          <w:kern w:val="0"/>
+          <w:sz w:val="22"/>
+          <w:szCs w:val="22"/>
+        </w:rPr>
         <w:t>2</w:t>
       </w:r>
       <w:r>
-        <w:rPr/>
+        <w:rPr>
+          <w:rFonts w:ascii="Calibri" w:hAnsi="Calibri" w:eastAsia="Calibri" w:cs="Calibri" w:asciiTheme="minorHAnsi" w:hAnsiTheme="minorHAnsi" w:eastAsiaTheme="minorHAnsi" w:csTheme="minorBidi"/>
+          <w:kern w:val="0"/>
+          <w:sz w:val="22"/>
+          <w:szCs w:val="22"/>
+        </w:rPr>
         <w:t xml:space="preserve">). </w:t>
       </w:r>
     </w:p>
     <w:p>
       <w:pPr>
         <w:pStyle w:val="Normal"/>
-        <w:rPr/>
-      </w:pPr>
-      <w:r>
-        <w:rPr/>
+        <w:jc w:val="left"/>
+      </w:pPr>
+      <w:r>
+        <w:rPr>
+          <w:rFonts w:ascii="Calibri" w:hAnsi="Calibri" w:eastAsia="Calibri" w:cs="Calibri" w:asciiTheme="minorHAnsi" w:hAnsiTheme="minorHAnsi" w:eastAsiaTheme="minorHAnsi" w:csTheme="minorBidi"/>
+          <w:kern w:val="0"/>
+          <w:sz w:val="22"/>
+          <w:szCs w:val="22"/>
+        </w:rPr>
         <w:t>En este segundo sprint se pretende comenzar con la implementación de las funcionalidades prioritarias del product backlog.</w:t>
       </w:r>
     </w:p>
     <w:p>
       <w:pPr>
         <w:pStyle w:val="Normal"/>
-        <w:rPr/>
-      </w:pPr>
-      <w:r>
-        <w:rPr/>
+        <w:jc w:val="left"/>
+      </w:pPr>
+      <w:bookmarkStart w:id="0" w:name="_GoBack"/>
+      <w:r>
+        <w:rPr>
+          <w:rFonts w:ascii="Calibri" w:hAnsi="Calibri" w:eastAsia="Calibri" w:cs="Calibri" w:asciiTheme="minorHAnsi" w:hAnsiTheme="minorHAnsi" w:eastAsiaTheme="minorHAnsi" w:csTheme="minorBidi"/>
+          <w:kern w:val="0"/>
+          <w:sz w:val="22"/>
+          <w:szCs w:val="22"/>
+        </w:rPr>
         <w:t>Desarrollar el sprint backlog descompo</w:t>
       </w:r>
-      <w:bookmarkStart w:id="0" w:name="_GoBack"/>
+      <w:r>
+        <w:rPr>
+          <w:rFonts w:ascii="Calibri" w:hAnsi="Calibri" w:eastAsia="Calibri" w:cs="Calibri" w:asciiTheme="minorHAnsi" w:hAnsiTheme="minorHAnsi" w:eastAsiaTheme="minorHAnsi" w:csTheme="minorBidi"/>
+          <w:kern w:val="0"/>
+          <w:sz w:val="22"/>
+          <w:szCs w:val="22"/>
+        </w:rPr>
+        <w:t xml:space="preserve">niendo las tareas necesarias estimadas para cumplir con el objetivo incluyendo tareas de análisis, diseño, desarrollo y prueba. El Producto Backlog y el Sprint Backlog </w:t>
+      </w:r>
+      <w:r>
+        <w:rPr>
+          <w:rFonts w:ascii="Calibri" w:hAnsi="Calibri" w:eastAsia="Calibri" w:cs="Calibri" w:asciiTheme="minorHAnsi" w:hAnsiTheme="minorHAnsi" w:eastAsiaTheme="minorHAnsi" w:csTheme="minorBidi"/>
+          <w:b/>
+          <w:bCs/>
+          <w:kern w:val="0"/>
+          <w:sz w:val="22"/>
+          <w:szCs w:val="22"/>
+        </w:rPr>
+        <w:t>debe presentarse el miércoles 1</w:t>
+      </w:r>
+      <w:r>
+        <w:rPr>
+          <w:rFonts w:ascii="Calibri" w:hAnsi="Calibri" w:eastAsia="Calibri" w:cs="Calibri" w:asciiTheme="minorHAnsi" w:hAnsiTheme="minorHAnsi" w:eastAsiaTheme="minorHAnsi" w:csTheme="minorBidi"/>
+          <w:b/>
+          <w:bCs/>
+          <w:kern w:val="0"/>
+          <w:sz w:val="22"/>
+          <w:szCs w:val="22"/>
+        </w:rPr>
+        <w:t>9</w:t>
+      </w:r>
+      <w:r>
+        <w:rPr>
+          <w:rFonts w:ascii="Calibri" w:hAnsi="Calibri" w:eastAsia="Calibri" w:cs="Calibri" w:asciiTheme="minorHAnsi" w:hAnsiTheme="minorHAnsi" w:eastAsiaTheme="minorHAnsi" w:csTheme="minorBidi"/>
+          <w:b/>
+          <w:bCs/>
+          <w:kern w:val="0"/>
+          <w:sz w:val="22"/>
+          <w:szCs w:val="22"/>
+        </w:rPr>
+        <w:t>/08</w:t>
+      </w:r>
+      <w:r>
+        <w:rPr>
+          <w:rFonts w:ascii="Calibri" w:hAnsi="Calibri" w:eastAsia="Calibri" w:cs="Calibri" w:asciiTheme="minorHAnsi" w:hAnsiTheme="minorHAnsi" w:eastAsiaTheme="minorHAnsi" w:csTheme="minorBidi"/>
+          <w:kern w:val="0"/>
+          <w:sz w:val="22"/>
+          <w:szCs w:val="22"/>
+        </w:rPr>
+        <w:t>.</w:t>
+      </w:r>
       <w:bookmarkEnd w:id="0"/>
-      <w:r>
-        <w:rPr/>
-        <w:t xml:space="preserve">niendo las tareas necesarias estimadas para cumplir con el objetivo incluyendo tareas de análisis, diseño, desarrollo y prueba. El Producto Backlog y el Sprint Backlog </w:t>
-      </w:r>
-      <w:r>
-        <w:rPr>
-          <w:b/>
-        </w:rPr>
-        <w:t>debe presentarse el miércoles 1</w:t>
-      </w:r>
-      <w:r>
-        <w:rPr>
-          <w:b/>
-        </w:rPr>
-        <w:t>9</w:t>
-      </w:r>
-      <w:r>
-        <w:rPr>
-          <w:b/>
-        </w:rPr>
-        <w:t>/08</w:t>
-      </w:r>
-      <w:r>
-        <w:rPr/>
-        <w:t>.</w:t>
-      </w:r>
     </w:p>
     <w:p>
       <w:pPr>
         <w:pStyle w:val="Normal"/>
-        <w:rPr/>
-      </w:pPr>
-      <w:r>
-        <w:rPr/>
+        <w:jc w:val="left"/>
+      </w:pPr>
+      <w:r>
+        <w:rPr>
+          <w:rFonts w:ascii="Calibri" w:hAnsi="Calibri" w:eastAsia="Calibri" w:cs="Calibri" w:asciiTheme="minorHAnsi" w:hAnsiTheme="minorHAnsi" w:eastAsiaTheme="minorHAnsi" w:csTheme="minorBidi"/>
+          <w:kern w:val="0"/>
+          <w:sz w:val="22"/>
+          <w:szCs w:val="22"/>
+        </w:rPr>
         <w:t>Crear un modelo de datos que refleje las necesidades de almacenamiento para cumplir con los requisitos incluidos en el product backlog.</w:t>
       </w:r>
     </w:p>
     <w:p>
       <w:pPr>
         <w:pStyle w:val="Normal"/>
-        <w:rPr/>
-      </w:pPr>
-      <w:r>
-        <w:rPr/>
+        <w:jc w:val="left"/>
+      </w:pPr>
+      <w:r>
+        <w:rPr>
+          <w:rFonts w:ascii="Calibri" w:hAnsi="Calibri" w:eastAsia="Calibri" w:cs="Calibri" w:asciiTheme="minorHAnsi" w:hAnsiTheme="minorHAnsi" w:eastAsiaTheme="minorHAnsi" w:csTheme="minorBidi"/>
+          <w:kern w:val="0"/>
+          <w:sz w:val="22"/>
+          <w:szCs w:val="22"/>
+        </w:rPr>
         <w:t>De cada HU elegida se debe realizar la estimación del valor que agrega al producto y del esfuerzo necesario para su desarrollo de cada una a implementar.</w:t>
       </w:r>
     </w:p>
     <w:p>
       <w:pPr>
         <w:pStyle w:val="Normal"/>
-        <w:rPr/>
-      </w:pPr>
-      <w:r>
-        <w:rPr/>
+        <w:jc w:val="left"/>
+      </w:pPr>
+      <w:r>
+        <w:rPr>
+          <w:rFonts w:ascii="Calibri" w:hAnsi="Calibri" w:eastAsia="Calibri" w:cs="Calibri" w:asciiTheme="minorHAnsi" w:hAnsiTheme="minorHAnsi" w:eastAsiaTheme="minorHAnsi" w:csTheme="minorBidi"/>
+          <w:kern w:val="0"/>
+          <w:sz w:val="22"/>
+          <w:szCs w:val="22"/>
+        </w:rPr>
         <w:t>En la reunión de retrospectiva cada grupo deberá presentar el sprint backlog teórico y el real con los tiempos de trabajo de cada actividad realizada.</w:t>
       </w:r>
     </w:p>
     <w:p>
       <w:pPr>
         <w:pStyle w:val="Normal"/>
-        <w:rPr/>
-      </w:pPr>
-      <w:r>
-        <w:rPr/>
+        <w:jc w:val="left"/>
+      </w:pPr>
+      <w:r>
+        <w:rPr>
+          <w:rFonts w:ascii="Calibri" w:hAnsi="Calibri" w:eastAsia="Calibri" w:cs="Calibri" w:asciiTheme="minorHAnsi" w:hAnsiTheme="minorHAnsi" w:eastAsiaTheme="minorHAnsi" w:csTheme="minorBidi"/>
+          <w:kern w:val="0"/>
+          <w:sz w:val="22"/>
+          <w:szCs w:val="22"/>
+        </w:rPr>
         <w:t>Para no perder el norte y el objetivo final del trabajo a continuación copio el material que se debe presentar a fin de año remarcando lo que ya tenemos desarrollado.</w:t>
       </w:r>
     </w:p>
     <w:p>
       <w:pPr>
         <w:pStyle w:val="Normal"/>
-        <w:rPr/>
-      </w:pPr>
-      <w:r>
-        <w:rPr/>
+        <w:jc w:val="left"/>
+      </w:pPr>
+      <w:r>
+        <w:rPr>
+          <w:rFonts w:ascii="Calibri" w:hAnsi="Calibri" w:eastAsia="Calibri" w:cs="Calibri" w:asciiTheme="minorHAnsi" w:hAnsiTheme="minorHAnsi" w:eastAsiaTheme="minorHAnsi" w:csTheme="minorBidi"/>
+          <w:kern w:val="0"/>
+          <w:sz w:val="22"/>
+          <w:szCs w:val="22"/>
+        </w:rPr>
         <w:t>Como trabajo al final del año se debe presentar:</w:t>
       </w:r>
     </w:p>
@@ -230,13 +325,19 @@
           <w:ilvl w:val="0"/>
           <w:numId w:val="1"/>
         </w:numPr>
-        <w:rPr>
-          <w:color w:themeColor="accent1" w:val="5B9BD5"/>
-        </w:rPr>
-      </w:pPr>
-      <w:r>
-        <w:rPr>
-          <w:color w:themeColor="accent1" w:val="5B9BD5"/>
+        <w:ind w:left="720" w:hanging="360"/>
+        <w:jc w:val="left"/>
+        <w:rPr>
+          <w:color w:val="5B9BD5" w:themeColor="accent1"/>
+        </w:rPr>
+      </w:pPr>
+      <w:r>
+        <w:rPr>
+          <w:rFonts w:ascii="Calibri" w:hAnsi="Calibri" w:eastAsia="Calibri" w:cs="Calibri" w:asciiTheme="minorHAnsi" w:hAnsiTheme="minorHAnsi" w:eastAsiaTheme="minorHAnsi" w:csTheme="minorBidi"/>
+          <w:color w:val="5B9BD5" w:themeColor="accent1"/>
+          <w:kern w:val="0"/>
+          <w:sz w:val="22"/>
+          <w:szCs w:val="22"/>
         </w:rPr>
         <w:t>Realizar un prototipo en papel del mismo.</w:t>
       </w:r>
@@ -248,13 +349,19 @@
           <w:ilvl w:val="0"/>
           <w:numId w:val="1"/>
         </w:numPr>
-        <w:rPr>
-          <w:color w:themeColor="accent1" w:val="5B9BD5"/>
-        </w:rPr>
-      </w:pPr>
-      <w:r>
-        <w:rPr>
-          <w:color w:themeColor="accent1" w:val="5B9BD5"/>
+        <w:ind w:left="720" w:hanging="360"/>
+        <w:jc w:val="left"/>
+        <w:rPr>
+          <w:color w:val="5B9BD5" w:themeColor="accent1"/>
+        </w:rPr>
+      </w:pPr>
+      <w:r>
+        <w:rPr>
+          <w:rFonts w:ascii="Calibri" w:hAnsi="Calibri" w:eastAsia="Calibri" w:cs="Calibri" w:asciiTheme="minorHAnsi" w:hAnsiTheme="minorHAnsi" w:eastAsiaTheme="minorHAnsi" w:csTheme="minorBidi"/>
+          <w:color w:val="5B9BD5" w:themeColor="accent1"/>
+          <w:kern w:val="0"/>
+          <w:sz w:val="22"/>
+          <w:szCs w:val="22"/>
         </w:rPr>
         <w:t>Armar el product backlog.</w:t>
       </w:r>
@@ -266,13 +373,19 @@
           <w:ilvl w:val="0"/>
           <w:numId w:val="1"/>
         </w:numPr>
-        <w:rPr>
-          <w:color w:themeColor="accent1" w:val="5B9BD5"/>
-        </w:rPr>
-      </w:pPr>
-      <w:r>
-        <w:rPr>
-          <w:color w:themeColor="accent1" w:val="5B9BD5"/>
+        <w:ind w:left="720" w:hanging="360"/>
+        <w:jc w:val="left"/>
+        <w:rPr>
+          <w:color w:val="5B9BD5" w:themeColor="accent1"/>
+        </w:rPr>
+      </w:pPr>
+      <w:r>
+        <w:rPr>
+          <w:rFonts w:ascii="Calibri" w:hAnsi="Calibri" w:eastAsia="Calibri" w:cs="Calibri" w:asciiTheme="minorHAnsi" w:hAnsiTheme="minorHAnsi" w:eastAsiaTheme="minorHAnsi" w:csTheme="minorBidi"/>
+          <w:color w:val="5B9BD5" w:themeColor="accent1"/>
+          <w:kern w:val="0"/>
+          <w:sz w:val="22"/>
+          <w:szCs w:val="22"/>
         </w:rPr>
         <w:t>Realizar un prototipo del sistema.</w:t>
       </w:r>
@@ -284,10 +397,16 @@
           <w:ilvl w:val="0"/>
           <w:numId w:val="1"/>
         </w:numPr>
-        <w:rPr/>
-      </w:pPr>
-      <w:r>
-        <w:rPr/>
+        <w:ind w:left="720" w:hanging="360"/>
+        <w:jc w:val="left"/>
+      </w:pPr>
+      <w:r>
+        <w:rPr>
+          <w:rFonts w:ascii="Calibri" w:hAnsi="Calibri" w:eastAsia="Calibri" w:cs="Calibri" w:asciiTheme="minorHAnsi" w:hAnsiTheme="minorHAnsi" w:eastAsiaTheme="minorHAnsi" w:csTheme="minorBidi"/>
+          <w:kern w:val="0"/>
+          <w:sz w:val="22"/>
+          <w:szCs w:val="22"/>
+        </w:rPr>
         <w:t>Armar los sprint backlog de cada iteración.</w:t>
       </w:r>
     </w:p>
@@ -298,10 +417,16 @@
           <w:ilvl w:val="1"/>
           <w:numId w:val="1"/>
         </w:numPr>
-        <w:rPr/>
-      </w:pPr>
-      <w:r>
-        <w:rPr/>
+        <w:ind w:left="1080" w:hanging="360"/>
+        <w:jc w:val="left"/>
+      </w:pPr>
+      <w:r>
+        <w:rPr>
+          <w:rFonts w:ascii="Calibri" w:hAnsi="Calibri" w:eastAsia="Calibri" w:cs="Calibri" w:asciiTheme="minorHAnsi" w:hAnsiTheme="minorHAnsi" w:eastAsiaTheme="minorHAnsi" w:csTheme="minorBidi"/>
+          <w:kern w:val="0"/>
+          <w:sz w:val="22"/>
+          <w:szCs w:val="22"/>
+        </w:rPr>
         <w:t>Realizar las estimaciones.</w:t>
       </w:r>
     </w:p>
@@ -312,10 +437,16 @@
           <w:ilvl w:val="1"/>
           <w:numId w:val="1"/>
         </w:numPr>
-        <w:rPr/>
-      </w:pPr>
-      <w:r>
-        <w:rPr/>
+        <w:ind w:left="1080" w:hanging="360"/>
+        <w:jc w:val="left"/>
+      </w:pPr>
+      <w:r>
+        <w:rPr>
+          <w:rFonts w:ascii="Calibri" w:hAnsi="Calibri" w:eastAsia="Calibri" w:cs="Calibri" w:asciiTheme="minorHAnsi" w:hAnsiTheme="minorHAnsi" w:eastAsiaTheme="minorHAnsi" w:csTheme="minorBidi"/>
+          <w:kern w:val="0"/>
+          <w:sz w:val="22"/>
+          <w:szCs w:val="22"/>
+        </w:rPr>
         <w:t>Presentar los tiempos reales de trabajo.</w:t>
       </w:r>
     </w:p>
@@ -326,17 +457,21 @@
           <w:ilvl w:val="0"/>
           <w:numId w:val="1"/>
         </w:numPr>
-        <w:rPr>
-          <w:b w:val="false"/>
-          <w:bCs w:val="false"/>
+        <w:ind w:left="720" w:hanging="360"/>
+        <w:jc w:val="left"/>
+        <w:rPr>
+          <w:b w:val="0"/>
+          <w:bCs w:val="0"/>
           <w:color w:val="000000"/>
         </w:rPr>
       </w:pPr>
       <w:r>
         <w:rPr>
-          <w:b w:val="false"/>
-          <w:bCs w:val="false"/>
+          <w:rFonts w:ascii="Calibri" w:hAnsi="Calibri" w:eastAsia="Calibri" w:cs="Calibri" w:asciiTheme="minorHAnsi" w:hAnsiTheme="minorHAnsi" w:eastAsiaTheme="minorHAnsi" w:csTheme="minorBidi"/>
           <w:color w:val="000000"/>
+          <w:kern w:val="0"/>
+          <w:sz w:val="22"/>
+          <w:szCs w:val="22"/>
         </w:rPr>
         <w:t>Armar un modelo de datos o de clases de la solución planteada.</w:t>
       </w:r>
@@ -348,10 +483,16 @@
           <w:ilvl w:val="0"/>
           <w:numId w:val="1"/>
         </w:numPr>
-        <w:rPr/>
-      </w:pPr>
-      <w:r>
-        <w:rPr/>
+        <w:ind w:left="720" w:hanging="360"/>
+        <w:jc w:val="left"/>
+      </w:pPr>
+      <w:r>
+        <w:rPr>
+          <w:rFonts w:ascii="Calibri" w:hAnsi="Calibri" w:eastAsia="Calibri" w:cs="Calibri" w:asciiTheme="minorHAnsi" w:hAnsiTheme="minorHAnsi" w:eastAsiaTheme="minorHAnsi" w:csTheme="minorBidi"/>
+          <w:kern w:val="0"/>
+          <w:sz w:val="22"/>
+          <w:szCs w:val="22"/>
+        </w:rPr>
         <w:t>Desarrollar el plan de calidad del proyecto</w:t>
       </w:r>
     </w:p>
@@ -362,10 +503,16 @@
           <w:ilvl w:val="1"/>
           <w:numId w:val="1"/>
         </w:numPr>
-        <w:rPr/>
-      </w:pPr>
-      <w:r>
-        <w:rPr/>
+        <w:ind w:left="1080" w:hanging="360"/>
+        <w:jc w:val="left"/>
+      </w:pPr>
+      <w:r>
+        <w:rPr>
+          <w:rFonts w:ascii="Calibri" w:hAnsi="Calibri" w:eastAsia="Calibri" w:cs="Calibri" w:asciiTheme="minorHAnsi" w:hAnsiTheme="minorHAnsi" w:eastAsiaTheme="minorHAnsi" w:csTheme="minorBidi"/>
+          <w:kern w:val="0"/>
+          <w:sz w:val="22"/>
+          <w:szCs w:val="22"/>
+        </w:rPr>
         <w:t>Definir un estándar de codificación.</w:t>
       </w:r>
     </w:p>
@@ -376,10 +523,16 @@
           <w:ilvl w:val="1"/>
           <w:numId w:val="1"/>
         </w:numPr>
-        <w:rPr/>
-      </w:pPr>
-      <w:r>
-        <w:rPr/>
+        <w:ind w:left="1080" w:hanging="360"/>
+        <w:jc w:val="left"/>
+      </w:pPr>
+      <w:r>
+        <w:rPr>
+          <w:rFonts w:ascii="Calibri" w:hAnsi="Calibri" w:eastAsia="Calibri" w:cs="Calibri" w:asciiTheme="minorHAnsi" w:hAnsiTheme="minorHAnsi" w:eastAsiaTheme="minorHAnsi" w:csTheme="minorBidi"/>
+          <w:kern w:val="0"/>
+          <w:sz w:val="22"/>
+          <w:szCs w:val="22"/>
+        </w:rPr>
         <w:t>Definir un estándar de diseño de interfaz a utilizar.</w:t>
       </w:r>
     </w:p>
@@ -390,10 +543,16 @@
           <w:ilvl w:val="1"/>
           <w:numId w:val="1"/>
         </w:numPr>
-        <w:rPr/>
-      </w:pPr>
-      <w:r>
-        <w:rPr/>
+        <w:ind w:left="1080" w:hanging="360"/>
+        <w:jc w:val="left"/>
+      </w:pPr>
+      <w:r>
+        <w:rPr>
+          <w:rFonts w:ascii="Calibri" w:hAnsi="Calibri" w:eastAsia="Calibri" w:cs="Calibri" w:asciiTheme="minorHAnsi" w:hAnsiTheme="minorHAnsi" w:eastAsiaTheme="minorHAnsi" w:csTheme="minorBidi"/>
+          <w:kern w:val="0"/>
+          <w:sz w:val="22"/>
+          <w:szCs w:val="22"/>
+        </w:rPr>
         <w:t>Armar un plan de pruebas unitarias de una ventana.</w:t>
       </w:r>
     </w:p>
@@ -401,13 +560,16 @@
       <w:pPr>
         <w:pStyle w:val="Normal"/>
         <w:widowControl/>
-        <w:bidi w:val="0"/>
-        <w:spacing w:lineRule="auto" w:line="259" w:before="0" w:after="160"/>
+        <w:spacing w:before="0" w:after="160" w:line="259" w:lineRule="auto"/>
         <w:jc w:val="left"/>
-        <w:rPr/>
-      </w:pPr>
-      <w:r>
-        <w:rPr/>
+      </w:pPr>
+      <w:r>
+        <w:rPr>
+          <w:rFonts w:ascii="Calibri" w:hAnsi="Calibri" w:eastAsia="Calibri" w:cs="Calibri" w:asciiTheme="minorHAnsi" w:hAnsiTheme="minorHAnsi" w:eastAsiaTheme="minorHAnsi" w:csTheme="minorBidi"/>
+          <w:kern w:val="0"/>
+          <w:sz w:val="22"/>
+          <w:szCs w:val="22"/>
+        </w:rPr>
         <w:t>Llevar el control de cambios del código en alguna herramienta de SCM. (github o similar).</w:t>
       </w:r>
     </w:p>
@@ -417,10 +579,7 @@
       <w:headerReference w:type="first" r:id="rId4"/>
       <w:type w:val="nextPage"/>
       <w:pgSz w:w="11906" w:h="16838"/>
-      <w:pgMar w:left="1701" w:right="1701" w:gutter="0" w:header="0" w:top="709" w:footer="0" w:bottom="1417"/>
-      <w:pgNumType w:fmt="decimal"/>
-      <w:formProt w:val="false"/>
-      <w:textDirection w:val="lrTb"/>
+      <w:pgMar w:top="709" w:right="1701" w:bottom="1417" w:left="1701" w:header="0" w:footer="0" w:gutter="0"/>
       <w:docGrid w:type="default" w:linePitch="360" w:charSpace="8192"/>
     </w:sectPr>
   </w:body>
@@ -428,64 +587,49 @@
 </file>
 
 <file path=word/header1.xml><?xml version="1.0" encoding="utf-8"?>
-<w:hdr xmlns:o="urn:schemas-microsoft-com:office:office" xmlns:r="http://schemas.openxmlformats.org/officeDocument/2006/relationships" xmlns:v="urn:schemas-microsoft-com:vml" xmlns:w="http://schemas.openxmlformats.org/wordprocessingml/2006/main" xmlns:w10="urn:schemas-microsoft-com:office:word" xmlns:wp="http://schemas.openxmlformats.org/drawingml/2006/wordprocessingDrawing" xmlns:wps="http://schemas.microsoft.com/office/word/2010/wordprocessingShape" xmlns:wpg="http://schemas.microsoft.com/office/word/2010/wordprocessingGroup" xmlns:mc="http://schemas.openxmlformats.org/markup-compatibility/2006" xmlns:wp14="http://schemas.microsoft.com/office/word/2010/wordprocessingDrawing" xmlns:w14="http://schemas.microsoft.com/office/word/2010/wordml" xmlns:w15="http://schemas.microsoft.com/office/word/2012/wordml" mc:Ignorable="w14 wp14 w15">
+<w:hdr xmlns:wpc="http://schemas.microsoft.com/office/word/2010/wordprocessingCanvas" xmlns:mc="http://schemas.openxmlformats.org/markup-compatibility/2006" xmlns:o="urn:schemas-microsoft-com:office:office" xmlns:r="http://schemas.openxmlformats.org/officeDocument/2006/relationships" xmlns:m="http://schemas.openxmlformats.org/officeDocument/2006/math" xmlns:v="urn:schemas-microsoft-com:vml" xmlns:wp14="http://schemas.microsoft.com/office/word/2010/wordprocessingDrawing" xmlns:wp="http://schemas.openxmlformats.org/drawingml/2006/wordprocessingDrawing" xmlns:w10="urn:schemas-microsoft-com:office:word" xmlns:w="http://schemas.openxmlformats.org/wordprocessingml/2006/main" xmlns:w14="http://schemas.microsoft.com/office/word/2010/wordml" xmlns:w15="http://schemas.microsoft.com/office/word/2012/wordml" xmlns:w16se="http://schemas.microsoft.com/office/word/2015/wordml/symex" xmlns:w16cid="http://schemas.microsoft.com/office/word/2016/wordml/cid" xmlns:w16="http://schemas.microsoft.com/office/word/2018/wordml" xmlns:w16cex="http://schemas.microsoft.com/office/word/2018/wordml/cex" xmlns:w16sdtdh="http://schemas.microsoft.com/office/word/2020/wordml/sdtdatahash" xmlns:wne="http://schemas.microsoft.com/office/word/2006/wordml" xmlns:wpg="http://schemas.microsoft.com/office/word/2010/wordprocessingGroup" xmlns:wps="http://schemas.microsoft.com/office/word/2010/wordprocessingShape">
   <w:p>
     <w:pPr>
       <w:pStyle w:val="Header"/>
-      <w:rPr/>
-    </w:pPr>
-    <w:r>
-      <w:rPr/>
-    </w:r>
+    </w:pPr>
+    <w:r/>
   </w:p>
 </w:hdr>
 </file>
 
 <file path=word/header2.xml><?xml version="1.0" encoding="utf-8"?>
-<w:hdr xmlns:o="urn:schemas-microsoft-com:office:office" xmlns:r="http://schemas.openxmlformats.org/officeDocument/2006/relationships" xmlns:v="urn:schemas-microsoft-com:vml" xmlns:w="http://schemas.openxmlformats.org/wordprocessingml/2006/main" xmlns:w10="urn:schemas-microsoft-com:office:word" xmlns:wp="http://schemas.openxmlformats.org/drawingml/2006/wordprocessingDrawing" xmlns:wps="http://schemas.microsoft.com/office/word/2010/wordprocessingShape" xmlns:wpg="http://schemas.microsoft.com/office/word/2010/wordprocessingGroup" xmlns:mc="http://schemas.openxmlformats.org/markup-compatibility/2006" xmlns:wp14="http://schemas.microsoft.com/office/word/2010/wordprocessingDrawing" xmlns:w14="http://schemas.microsoft.com/office/word/2010/wordml" xmlns:w15="http://schemas.microsoft.com/office/word/2012/wordml" mc:Ignorable="w14 wp14 w15">
+<w:hdr xmlns:wpc="http://schemas.microsoft.com/office/word/2010/wordprocessingCanvas" xmlns:mc="http://schemas.openxmlformats.org/markup-compatibility/2006" xmlns:o="urn:schemas-microsoft-com:office:office" xmlns:r="http://schemas.openxmlformats.org/officeDocument/2006/relationships" xmlns:m="http://schemas.openxmlformats.org/officeDocument/2006/math" xmlns:v="urn:schemas-microsoft-com:vml" xmlns:wp14="http://schemas.microsoft.com/office/word/2010/wordprocessingDrawing" xmlns:wp="http://schemas.openxmlformats.org/drawingml/2006/wordprocessingDrawing" xmlns:w10="urn:schemas-microsoft-com:office:word" xmlns:w="http://schemas.openxmlformats.org/wordprocessingml/2006/main" xmlns:w14="http://schemas.microsoft.com/office/word/2010/wordml" xmlns:w15="http://schemas.microsoft.com/office/word/2012/wordml" xmlns:w16se="http://schemas.microsoft.com/office/word/2015/wordml/symex" xmlns:w16cid="http://schemas.microsoft.com/office/word/2016/wordml/cid" xmlns:w16="http://schemas.microsoft.com/office/word/2018/wordml" xmlns:w16cex="http://schemas.microsoft.com/office/word/2018/wordml/cex" xmlns:w16sdtdh="http://schemas.microsoft.com/office/word/2020/wordml/sdtdatahash" xmlns:wne="http://schemas.microsoft.com/office/word/2006/wordml" xmlns:wpg="http://schemas.microsoft.com/office/word/2010/wordprocessingGroup" xmlns:wps="http://schemas.microsoft.com/office/word/2010/wordprocessingShape">
   <w:p>
     <w:pPr>
       <w:pStyle w:val="Header"/>
-      <w:rPr/>
-    </w:pPr>
-    <w:r>
-      <w:rPr/>
-    </w:r>
+    </w:pPr>
+    <w:r/>
   </w:p>
   <w:p>
     <w:pPr>
       <w:pStyle w:val="Header"/>
-      <w:rPr/>
-    </w:pPr>
-    <w:r>
-      <w:rPr/>
-    </w:r>
+    </w:pPr>
+    <w:r/>
   </w:p>
   <w:p>
     <w:pPr>
       <w:pStyle w:val="Header"/>
-      <w:rPr/>
-    </w:pPr>
-    <w:r>
-      <w:rPr/>
-    </w:r>
+    </w:pPr>
+    <w:r/>
   </w:p>
   <w:p>
     <w:pPr>
       <w:pStyle w:val="Header"/>
-      <w:rPr/>
-    </w:pPr>
-    <w:r>
-      <w:rPr/>
-    </w:r>
+    </w:pPr>
+    <w:r/>
   </w:p>
   <w:p>
     <w:pPr>
       <w:pStyle w:val="Normal"/>
       <w:tabs>
         <w:tab w:val="clear" w:pos="708"/>
-        <w:tab w:val="left" w:pos="3240" w:leader="none"/>
-        <w:tab w:val="center" w:pos="4252" w:leader="none"/>
+        <w:tab w:val="left" w:pos="3240"/>
+        <w:tab w:val="center" w:pos="4252"/>
       </w:tabs>
       <w:spacing w:before="0" w:after="0"/>
       <w:jc w:val="center"/>
@@ -496,32 +640,41 @@
       </w:rPr>
     </w:pPr>
     <w:r>
-      <w:rPr/>
-      <w:object>
-        <v:shapetype id="_x0000_tole_rId1" coordsize="21600,21600" o:spt="ole_rId1" o:preferrelative="t" path="m@4@5l@4@11@9@11@9@5xe" filled="f" stroked="f">
-          <v:stroke joinstyle="miter"/>
-          <v:formulas>
-            <v:f eqn="if lineDrawn pixelLineWidth 0"/>
-            <v:f eqn="sum @0 1 0"/>
-            <v:f eqn="sum 0 0 @1"/>
-            <v:f eqn="prod @2 1 2"/>
-            <v:f eqn="prod @3 21600 pixelWidth"/>
-            <v:f eqn="prod @3 21600 pixelHeight"/>
-            <v:f eqn="sum @0 0 1"/>
-            <v:f eqn="prod @6 1 2"/>
-            <v:f eqn="prod @7 21600 pixelWidth"/>
-            <v:f eqn="sum @8 21600 0"/>
-            <v:f eqn="prod @7 21600 pixelHeight"/>
-            <v:f eqn="sum @10 21600 0"/>
-          </v:formulas>
-          <v:path o:extrusionok="f" gradientshapeok="t" o:connecttype="rect"/>
-          <o:lock v:ext="edit" aspectratio="t"/>
-        </v:shapetype>
-        <v:shape id="ole_rId1" type="_x0000_tole_rId1" style="width:27pt;height:32.25pt;mso-wrap-distance-right:0pt" filled="f" o:ole="">
-          <v:imagedata r:id="rId2" o:title=""/>
-        </v:shape>
-        <o:OLEObject Type="Embed" ProgID="CorelDraw.Graphic.8" ShapeID="ole_rId1" DrawAspect="Content" ObjectID="_1547212448" r:id="rId1"/>
-      </w:object>
+      <w:drawing>
+        <wp:inline distT="0" distB="0" distL="0" distR="0">
+          <wp:extent cx="342900" cy="409575"/>
+          <wp:effectExtent l="0" t="0" r="0" b="0"/>
+          <wp:docPr id="100000" name="image2.png"/>
+          <wp:cNvGraphicFramePr>
+            <a:graphicFrameLocks xmlns:a="http://schemas.openxmlformats.org/drawingml/2006/main" noChangeAspect="1"/>
+          </wp:cNvGraphicFramePr>
+          <a:graphic xmlns:a="http://schemas.openxmlformats.org/drawingml/2006/main">
+            <a:graphicData uri="http://schemas.openxmlformats.org/drawingml/2006/picture">
+              <pic:pic xmlns:pic="http://schemas.openxmlformats.org/drawingml/2006/picture">
+                <pic:nvPicPr>
+                  <pic:cNvPr id="100000" name="image2.png"/>
+                  <pic:cNvPicPr/>
+                </pic:nvPicPr>
+                <pic:blipFill>
+                  <a:blip r:embed="rId3"/>
+                  <a:stretch>
+                    <a:fillRect/>
+                  </a:stretch>
+                </pic:blipFill>
+                <pic:spPr>
+                  <a:xfrm>
+                    <a:off x="0" y="0"/>
+                    <a:ext cx="342900" cy="409575"/>
+                  </a:xfrm>
+                  <a:prstGeom prst="rect">
+                    <a:avLst/>
+                  </a:prstGeom>
+                </pic:spPr>
+              </pic:pic>
+            </a:graphicData>
+          </a:graphic>
+        </wp:inline>
+      </w:drawing>
     </w:r>
   </w:p>
   <w:p>
@@ -529,8 +682,8 @@
       <w:pStyle w:val="Normal"/>
       <w:tabs>
         <w:tab w:val="clear" w:pos="708"/>
-        <w:tab w:val="left" w:pos="3240" w:leader="none"/>
-        <w:tab w:val="center" w:pos="4252" w:leader="none"/>
+        <w:tab w:val="left" w:pos="3240"/>
+        <w:tab w:val="center" w:pos="4252"/>
       </w:tabs>
       <w:spacing w:before="0" w:after="0"/>
       <w:jc w:val="center"/>
@@ -552,8 +705,8 @@
       <w:pStyle w:val="Normal"/>
       <w:tabs>
         <w:tab w:val="clear" w:pos="708"/>
-        <w:tab w:val="left" w:pos="3240" w:leader="none"/>
-        <w:tab w:val="center" w:pos="4252" w:leader="none"/>
+        <w:tab w:val="left" w:pos="3240"/>
+        <w:tab w:val="center" w:pos="4252"/>
       </w:tabs>
       <w:spacing w:before="0" w:after="0"/>
       <w:jc w:val="center"/>
@@ -573,60 +726,45 @@
   <w:p>
     <w:pPr>
       <w:pStyle w:val="Header"/>
-      <w:rPr/>
-    </w:pPr>
-    <w:r>
-      <w:rPr/>
-    </w:r>
+    </w:pPr>
+    <w:r/>
   </w:p>
 </w:hdr>
 </file>
 
 <file path=word/header3.xml><?xml version="1.0" encoding="utf-8"?>
-<w:hdr xmlns:o="urn:schemas-microsoft-com:office:office" xmlns:r="http://schemas.openxmlformats.org/officeDocument/2006/relationships" xmlns:v="urn:schemas-microsoft-com:vml" xmlns:w="http://schemas.openxmlformats.org/wordprocessingml/2006/main" xmlns:w10="urn:schemas-microsoft-com:office:word" xmlns:wp="http://schemas.openxmlformats.org/drawingml/2006/wordprocessingDrawing" xmlns:wps="http://schemas.microsoft.com/office/word/2010/wordprocessingShape" xmlns:wpg="http://schemas.microsoft.com/office/word/2010/wordprocessingGroup" xmlns:mc="http://schemas.openxmlformats.org/markup-compatibility/2006" xmlns:wp14="http://schemas.microsoft.com/office/word/2010/wordprocessingDrawing" xmlns:w14="http://schemas.microsoft.com/office/word/2010/wordml" xmlns:w15="http://schemas.microsoft.com/office/word/2012/wordml" mc:Ignorable="w14 wp14 w15">
+<w:hdr xmlns:wpc="http://schemas.microsoft.com/office/word/2010/wordprocessingCanvas" xmlns:mc="http://schemas.openxmlformats.org/markup-compatibility/2006" xmlns:o="urn:schemas-microsoft-com:office:office" xmlns:r="http://schemas.openxmlformats.org/officeDocument/2006/relationships" xmlns:m="http://schemas.openxmlformats.org/officeDocument/2006/math" xmlns:v="urn:schemas-microsoft-com:vml" xmlns:wp14="http://schemas.microsoft.com/office/word/2010/wordprocessingDrawing" xmlns:wp="http://schemas.openxmlformats.org/drawingml/2006/wordprocessingDrawing" xmlns:w10="urn:schemas-microsoft-com:office:word" xmlns:w="http://schemas.openxmlformats.org/wordprocessingml/2006/main" xmlns:w14="http://schemas.microsoft.com/office/word/2010/wordml" xmlns:w15="http://schemas.microsoft.com/office/word/2012/wordml" xmlns:w16se="http://schemas.microsoft.com/office/word/2015/wordml/symex" xmlns:w16cid="http://schemas.microsoft.com/office/word/2016/wordml/cid" xmlns:w16="http://schemas.microsoft.com/office/word/2018/wordml" xmlns:w16cex="http://schemas.microsoft.com/office/word/2018/wordml/cex" xmlns:w16sdtdh="http://schemas.microsoft.com/office/word/2020/wordml/sdtdatahash" xmlns:wne="http://schemas.microsoft.com/office/word/2006/wordml" xmlns:wpg="http://schemas.microsoft.com/office/word/2010/wordprocessingGroup" xmlns:wps="http://schemas.microsoft.com/office/word/2010/wordprocessingShape">
   <w:p>
     <w:pPr>
       <w:pStyle w:val="Header"/>
-      <w:rPr/>
-    </w:pPr>
-    <w:r>
-      <w:rPr/>
-    </w:r>
+    </w:pPr>
+    <w:r/>
   </w:p>
   <w:p>
     <w:pPr>
       <w:pStyle w:val="Header"/>
-      <w:rPr/>
-    </w:pPr>
-    <w:r>
-      <w:rPr/>
-    </w:r>
+    </w:pPr>
+    <w:r/>
   </w:p>
   <w:p>
     <w:pPr>
       <w:pStyle w:val="Header"/>
-      <w:rPr/>
-    </w:pPr>
-    <w:r>
-      <w:rPr/>
-    </w:r>
+    </w:pPr>
+    <w:r/>
   </w:p>
   <w:p>
     <w:pPr>
       <w:pStyle w:val="Header"/>
-      <w:rPr/>
-    </w:pPr>
-    <w:r>
-      <w:rPr/>
-    </w:r>
+    </w:pPr>
+    <w:r/>
   </w:p>
   <w:p>
     <w:pPr>
       <w:pStyle w:val="Normal"/>
       <w:tabs>
         <w:tab w:val="clear" w:pos="708"/>
-        <w:tab w:val="left" w:pos="3240" w:leader="none"/>
-        <w:tab w:val="center" w:pos="4252" w:leader="none"/>
+        <w:tab w:val="left" w:pos="3240"/>
+        <w:tab w:val="center" w:pos="4252"/>
       </w:tabs>
       <w:spacing w:before="0" w:after="0"/>
       <w:jc w:val="center"/>
@@ -637,32 +775,41 @@
       </w:rPr>
     </w:pPr>
     <w:r>
-      <w:rPr/>
-      <w:object>
-        <v:shapetype id="_x0000_tole_rId1" coordsize="21600,21600" o:spt="ole_rId1" o:preferrelative="t" path="m@4@5l@4@11@9@11@9@5xe" filled="f" stroked="f">
-          <v:stroke joinstyle="miter"/>
-          <v:formulas>
-            <v:f eqn="if lineDrawn pixelLineWidth 0"/>
-            <v:f eqn="sum @0 1 0"/>
-            <v:f eqn="sum 0 0 @1"/>
-            <v:f eqn="prod @2 1 2"/>
-            <v:f eqn="prod @3 21600 pixelWidth"/>
-            <v:f eqn="prod @3 21600 pixelHeight"/>
-            <v:f eqn="sum @0 0 1"/>
-            <v:f eqn="prod @6 1 2"/>
-            <v:f eqn="prod @7 21600 pixelWidth"/>
-            <v:f eqn="sum @8 21600 0"/>
-            <v:f eqn="prod @7 21600 pixelHeight"/>
-            <v:f eqn="sum @10 21600 0"/>
-          </v:formulas>
-          <v:path o:extrusionok="f" gradientshapeok="t" o:connecttype="rect"/>
-          <o:lock v:ext="edit" aspectratio="t"/>
-        </v:shapetype>
-        <v:shape id="ole_rId1" type="_x0000_tole_rId1" style="width:27pt;height:32.25pt;mso-wrap-distance-right:0pt" filled="f" o:ole="">
-          <v:imagedata r:id="rId2" o:title=""/>
-        </v:shape>
-        <o:OLEObject Type="Embed" ProgID="CorelDraw.Graphic.8" ShapeID="ole_rId1" DrawAspect="Content" ObjectID="_693504421" r:id="rId1"/>
-      </w:object>
+      <w:drawing>
+        <wp:inline distT="0" distB="0" distL="0" distR="0">
+          <wp:extent cx="342900" cy="409575"/>
+          <wp:effectExtent l="0" t="0" r="0" b="0"/>
+          <wp:docPr id="100001" name="image3.png"/>
+          <wp:cNvGraphicFramePr>
+            <a:graphicFrameLocks xmlns:a="http://schemas.openxmlformats.org/drawingml/2006/main" noChangeAspect="1"/>
+          </wp:cNvGraphicFramePr>
+          <a:graphic xmlns:a="http://schemas.openxmlformats.org/drawingml/2006/main">
+            <a:graphicData uri="http://schemas.openxmlformats.org/drawingml/2006/picture">
+              <pic:pic xmlns:pic="http://schemas.openxmlformats.org/drawingml/2006/picture">
+                <pic:nvPicPr>
+                  <pic:cNvPr id="100001" name="image3.png"/>
+                  <pic:cNvPicPr/>
+                </pic:nvPicPr>
+                <pic:blipFill>
+                  <a:blip r:embed="rId3"/>
+                  <a:stretch>
+                    <a:fillRect/>
+                  </a:stretch>
+                </pic:blipFill>
+                <pic:spPr>
+                  <a:xfrm>
+                    <a:off x="0" y="0"/>
+                    <a:ext cx="342900" cy="409575"/>
+                  </a:xfrm>
+                  <a:prstGeom prst="rect">
+                    <a:avLst/>
+                  </a:prstGeom>
+                </pic:spPr>
+              </pic:pic>
+            </a:graphicData>
+          </a:graphic>
+        </wp:inline>
+      </w:drawing>
     </w:r>
   </w:p>
   <w:p>
@@ -670,8 +817,8 @@
       <w:pStyle w:val="Normal"/>
       <w:tabs>
         <w:tab w:val="clear" w:pos="708"/>
-        <w:tab w:val="left" w:pos="3240" w:leader="none"/>
-        <w:tab w:val="center" w:pos="4252" w:leader="none"/>
+        <w:tab w:val="left" w:pos="3240"/>
+        <w:tab w:val="center" w:pos="4252"/>
       </w:tabs>
       <w:spacing w:before="0" w:after="0"/>
       <w:jc w:val="center"/>
@@ -693,8 +840,8 @@
       <w:pStyle w:val="Normal"/>
       <w:tabs>
         <w:tab w:val="clear" w:pos="708"/>
-        <w:tab w:val="left" w:pos="3240" w:leader="none"/>
-        <w:tab w:val="center" w:pos="4252" w:leader="none"/>
+        <w:tab w:val="left" w:pos="3240"/>
+        <w:tab w:val="center" w:pos="4252"/>
       </w:tabs>
       <w:spacing w:before="0" w:after="0"/>
       <w:jc w:val="center"/>
@@ -714,11 +861,8 @@
   <w:p>
     <w:pPr>
       <w:pStyle w:val="Header"/>
-      <w:rPr/>
-    </w:pPr>
-    <w:r>
-      <w:rPr/>
-    </w:r>
+    </w:pPr>
+    <w:r/>
   </w:p>
 </w:hdr>
 </file>

</xml_diff>